<commit_message>
docs: broaden FINAL_DOCUMENTATION_POPULATED to reflect context-window work
Adds token-accounting instrumentation notes, a KV-cache VRAM paragraph and two
env-var rows (OLLAMA_FLASH_ATTENTION, OLLAMA_KV_CACHE_TYPE), the per-turn recall
de-duplication note, and the run_gpu_servers.sh export note. Structure, images
and tables preserved; no em-dashes.

Co-Authored-By: Claude Opus 4.8 <noreply@anthropic.com>
</commit_message>
<xml_diff>
--- a/docs/FINAL_DOCUMENTATION_POPULATED.docx
+++ b/docs/FINAL_DOCUMENTATION_POPULATED.docx
@@ -16303,6 +16303,32 @@
     </w:p>
     <w:p>
       <w:pPr>
+        <w:spacing w:after="60"/>
+      </w:pPr>
+      <w:r>
+        <w:rPr>
+          <w:color w:val="2B2B2B"/>
+          <w:sz w:val="20"/>
+          <w:szCs w:val="20"/>
+        </w:rPr>
+        <w:t>• context: prompt=%d tok (%.0f%% of num_ctx), output=%d tok, emitted once per reply from Ollama's done message. It is read after the last token, so it never sits on the first-token path, and it is also stored on the engine as last_prompt_tokens for callers that want to budget the window.</w:t>
+      </w:r>
+    </w:p>
+    <w:p>
+      <w:pPr>
+        <w:spacing w:after="60"/>
+      </w:pPr>
+      <w:r>
+        <w:rPr>
+          <w:color w:val="2B2B2B"/>
+          <w:sz w:val="20"/>
+          <w:szCs w:val="20"/>
+        </w:rPr>
+        <w:t>• context near limit, a warning raised the moment the prompt reaches 90 percent of num_ctx. Ollama truncates from the front, so without this the persona or the memory block can be dropped before the model ever sees them, silently and with no error.</w:t>
+      </w:r>
+    </w:p>
+    <w:p>
+      <w:pPr>
         <w:spacing w:after="160"/>
       </w:pPr>
       <w:r>
@@ -16340,6 +16366,19 @@
           <w:szCs w:val="20"/>
         </w:rPr>
         <w:t xml:space="preserve">There is no distributed tracing, no metrics exporter, no APM, and no structured/JSON logging. Correlating a Pi log line with a GPU log line is done by wall-clock timestamp.</w:t>
+      </w:r>
+    </w:p>
+    <w:p>
+      <w:pPr>
+        <w:spacing w:after="120"/>
+      </w:pPr>
+      <w:r>
+        <w:rPr>
+          <w:color w:val="2B2B2B"/>
+          <w:sz w:val="20"/>
+          <w:szCs w:val="20"/>
+        </w:rPr>
+        <w:t>Context-window utilization is, however, observable per turn: the prompt and output token counts above make it visible when history, memory and keyframes are crowding the window, which is the signal to compact sooner or to raise num_ctx once the KV cache has room.</w:t>
       </w:r>
     </w:p>
     <w:p>
@@ -30589,6 +30628,200 @@
           </w:p>
         </w:tc>
       </w:tr>
+      <w:tr>
+        <w:tc>
+          <w:tcPr>
+            <w:tcW w:w="0" w:type="auto"/>
+            <w:tcMar>
+              <w:top w:w="40" w:type="dxa"/>
+              <w:left w:w="80" w:type="dxa"/>
+              <w:bottom w:w="40" w:type="dxa"/>
+              <w:right w:w="80" w:type="dxa"/>
+            </w:tcMar>
+          </w:tcPr>
+          <w:p>
+            <w:pPr>
+              <w:spacing w:after="0"/>
+            </w:pPr>
+            <w:r>
+              <w:t>OLLAMA_FLASH_ATTENTION</w:t>
+            </w:r>
+          </w:p>
+        </w:tc>
+        <w:tc>
+          <w:tcPr>
+            <w:tcW w:w="0" w:type="auto"/>
+            <w:tcMar>
+              <w:top w:w="40" w:type="dxa"/>
+              <w:left w:w="80" w:type="dxa"/>
+              <w:bottom w:w="40" w:type="dxa"/>
+              <w:right w:w="80" w:type="dxa"/>
+            </w:tcMar>
+          </w:tcPr>
+          <w:p>
+            <w:pPr>
+              <w:spacing w:after="0"/>
+            </w:pPr>
+            <w:r>
+              <w:t>scripts/run_gpu_servers.sh, Ollama service</w:t>
+            </w:r>
+          </w:p>
+        </w:tc>
+        <w:tc>
+          <w:tcPr>
+            <w:tcW w:w="0" w:type="auto"/>
+            <w:tcMar>
+              <w:top w:w="40" w:type="dxa"/>
+              <w:left w:w="80" w:type="dxa"/>
+              <w:bottom w:w="40" w:type="dxa"/>
+              <w:right w:w="80" w:type="dxa"/>
+            </w:tcMar>
+          </w:tcPr>
+          <w:p>
+            <w:pPr>
+              <w:spacing w:after="0"/>
+            </w:pPr>
+            <w:r>
+              <w:t>0/1</w:t>
+            </w:r>
+          </w:p>
+        </w:tc>
+        <w:tc>
+          <w:tcPr>
+            <w:tcW w:w="0" w:type="auto"/>
+            <w:tcMar>
+              <w:top w:w="40" w:type="dxa"/>
+              <w:left w:w="80" w:type="dxa"/>
+              <w:bottom w:w="40" w:type="dxa"/>
+              <w:right w:w="80" w:type="dxa"/>
+            </w:tcMar>
+          </w:tcPr>
+          <w:p>
+            <w:pPr>
+              <w:spacing w:after="0"/>
+            </w:pPr>
+            <w:r>
+              <w:t>1 (set by the script)</w:t>
+            </w:r>
+          </w:p>
+        </w:tc>
+        <w:tc>
+          <w:tcPr>
+            <w:tcW w:w="0" w:type="auto"/>
+            <w:tcMar>
+              <w:top w:w="40" w:type="dxa"/>
+              <w:left w:w="80" w:type="dxa"/>
+              <w:bottom w:w="40" w:type="dxa"/>
+              <w:right w:w="80" w:type="dxa"/>
+            </w:tcMar>
+          </w:tcPr>
+          <w:p>
+            <w:pPr>
+              <w:spacing w:after="0"/>
+            </w:pPr>
+            <w:r>
+              <w:t>Enables flash attention. Required for a quantized KV cache and faster attention besides.</w:t>
+            </w:r>
+          </w:p>
+        </w:tc>
+      </w:tr>
+      <w:tr>
+        <w:tc>
+          <w:tcPr>
+            <w:tcW w:w="0" w:type="auto"/>
+            <w:tcMar>
+              <w:top w:w="40" w:type="dxa"/>
+              <w:left w:w="80" w:type="dxa"/>
+              <w:bottom w:w="40" w:type="dxa"/>
+              <w:right w:w="80" w:type="dxa"/>
+            </w:tcMar>
+          </w:tcPr>
+          <w:p>
+            <w:pPr>
+              <w:spacing w:after="0"/>
+            </w:pPr>
+            <w:r>
+              <w:t>OLLAMA_KV_CACHE_TYPE</w:t>
+            </w:r>
+          </w:p>
+        </w:tc>
+        <w:tc>
+          <w:tcPr>
+            <w:tcW w:w="0" w:type="auto"/>
+            <w:tcMar>
+              <w:top w:w="40" w:type="dxa"/>
+              <w:left w:w="80" w:type="dxa"/>
+              <w:bottom w:w="40" w:type="dxa"/>
+              <w:right w:w="80" w:type="dxa"/>
+            </w:tcMar>
+          </w:tcPr>
+          <w:p>
+            <w:pPr>
+              <w:spacing w:after="0"/>
+            </w:pPr>
+            <w:r>
+              <w:t>scripts/run_gpu_servers.sh, Ollama service</w:t>
+            </w:r>
+          </w:p>
+        </w:tc>
+        <w:tc>
+          <w:tcPr>
+            <w:tcW w:w="0" w:type="auto"/>
+            <w:tcMar>
+              <w:top w:w="40" w:type="dxa"/>
+              <w:left w:w="80" w:type="dxa"/>
+              <w:bottom w:w="40" w:type="dxa"/>
+              <w:right w:w="80" w:type="dxa"/>
+            </w:tcMar>
+          </w:tcPr>
+          <w:p>
+            <w:pPr>
+              <w:spacing w:after="0"/>
+            </w:pPr>
+            <w:r>
+              <w:t>enum</w:t>
+            </w:r>
+          </w:p>
+        </w:tc>
+        <w:tc>
+          <w:tcPr>
+            <w:tcW w:w="0" w:type="auto"/>
+            <w:tcMar>
+              <w:top w:w="40" w:type="dxa"/>
+              <w:left w:w="80" w:type="dxa"/>
+              <w:bottom w:w="40" w:type="dxa"/>
+              <w:right w:w="80" w:type="dxa"/>
+            </w:tcMar>
+          </w:tcPr>
+          <w:p>
+            <w:pPr>
+              <w:spacing w:after="0"/>
+            </w:pPr>
+            <w:r>
+              <w:t>q8_0 (set by the script)</w:t>
+            </w:r>
+          </w:p>
+        </w:tc>
+        <w:tc>
+          <w:tcPr>
+            <w:tcW w:w="0" w:type="auto"/>
+            <w:tcMar>
+              <w:top w:w="40" w:type="dxa"/>
+              <w:left w:w="80" w:type="dxa"/>
+              <w:bottom w:w="40" w:type="dxa"/>
+              <w:right w:w="80" w:type="dxa"/>
+            </w:tcMar>
+          </w:tcPr>
+          <w:p>
+            <w:pPr>
+              <w:spacing w:after="0"/>
+            </w:pPr>
+            <w:r>
+              <w:t>Quantizes the LLM KV cache. q8_0 halves its VRAM at negligible quality loss, reducing mid-session eviction of the chat model.</w:t>
+            </w:r>
+          </w:p>
+        </w:tc>
+      </w:tr>
     </w:tbl>
     <w:p>
       <w:pPr>
@@ -35963,6 +36196,19 @@
     </w:tbl>
     <w:p>
       <w:pPr>
+        <w:spacing w:after="120"/>
+      </w:pPr>
+      <w:r>
+        <w:rPr>
+          <w:color w:val="2B2B2B"/>
+          <w:sz w:val="20"/>
+          <w:szCs w:val="20"/>
+        </w:rPr>
+        <w:t>Per-turn recall is de-duplicated against the conversation-start memory block. relevant_block(query, exclude=...) drops any fact whose text is already present in the injected block, so the same fact is never spent twice in one prompt and the model is not handed a fact it was about to recite. The exclusion string is the durable block exposed by Conversation.memory_block.</w:t>
+      </w:r>
+    </w:p>
+    <w:p>
+      <w:pPr>
         <w:spacing w:after="80"/>
       </w:pPr>
       <w:r>
@@ -46792,6 +47038,19 @@
     </w:tbl>
     <w:p>
       <w:pPr>
+        <w:spacing w:after="120"/>
+      </w:pPr>
+      <w:r>
+        <w:rPr>
+          <w:color w:val="2B2B2B"/>
+          <w:sz w:val="20"/>
+          <w:szCs w:val="20"/>
+        </w:rPr>
+        <w:t>Reclaiming context headroom without more VRAM: the KV cache is the constraint that forced num_ctx down to 4096 on the shared card. Setting OLLAMA_KV_CACHE_TYPE=q8_0 together with OLLAMA_FLASH_ATTENTION=1 on the Ollama process roughly halves the KV-cache footprint at negligible quality cost. That either buys room to raise num_ctx back toward 8192, or frees VRAM so the chat model is not evicted mid-session, which is the cause of the multi-second first-token stall. scripts/run_gpu_servers.sh exports both variables; set the same two in the Ollama systemd unit when it runs as a service.</w:t>
+      </w:r>
+    </w:p>
+    <w:p>
+      <w:pPr>
         <w:spacing w:after="80"/>
       </w:pPr>
       <w:r>
@@ -54983,6 +55242,19 @@
         </w:tc>
       </w:tr>
     </w:tbl>
+    <w:p>
+      <w:pPr>
+        <w:spacing w:after="120"/>
+      </w:pPr>
+      <w:r>
+        <w:rPr>
+          <w:color w:val="2B2B2B"/>
+          <w:sz w:val="20"/>
+          <w:szCs w:val="20"/>
+        </w:rPr>
+        <w:t>Before it launches Ollama, the script exports OLLAMA_FLASH_ATTENTION=1 and OLLAMA_KV_CACHE_TYPE=q8_0 (both overridable from the environment), so a smaller quantized KV cache is used whenever this script starts the server. When Ollama runs as a system service instead, set the same two variables in its unit with systemctl edit ollama, because a process the script does not start does not inherit them.</w:t>
+      </w:r>
+    </w:p>
     <w:p>
       <w:pPr>
         <w:spacing w:after="80"/>

</xml_diff>